<commit_message>
Update final Part B report links
</commit_message>
<xml_diff>
--- a/report/report.docx
+++ b/report/report.docx
@@ -48,6 +48,127 @@
         <w:pStyle w:val="1"/>
         <w:spacing w:before="120" w:after="80" w:line="240" w:lineRule="auto"/>
         <w:rPr>
+          <w:rFonts w:hint="eastAsia"/>
+          <w:b w:val="0"/>
+          <w:bCs w:val="0"/>
+          <w:color w:val="000000" w:themeColor="text1"/>
+          <w:sz w:val="20"/>
+          <w:szCs w:val="20"/>
+          <w:lang w:eastAsia="zh-CN"/>
+        </w:rPr>
+      </w:pPr>
+      <w:r>
+        <w:rPr>
+          <w:b w:val="0"/>
+          <w:bCs w:val="0"/>
+          <w:color w:val="000000" w:themeColor="text1"/>
+          <w:sz w:val="20"/>
+          <w:szCs w:val="20"/>
+          <w:lang w:eastAsia="zh-CN"/>
+        </w:rPr>
+        <w:t>Public GitHub repository:</w:t>
+      </w:r>
+      <w:r>
+        <w:rPr>
+          <w:rFonts w:hint="eastAsia"/>
+          <w:b w:val="0"/>
+          <w:bCs w:val="0"/>
+          <w:color w:val="000000" w:themeColor="text1"/>
+          <w:sz w:val="20"/>
+          <w:szCs w:val="20"/>
+          <w:lang w:eastAsia="zh-CN"/>
+        </w:rPr>
+        <w:t xml:space="preserve">  </w:t>
+      </w:r>
+      <w:r>
+        <w:rPr>
+          <w:b w:val="0"/>
+          <w:bCs w:val="0"/>
+          <w:color w:val="000000" w:themeColor="text1"/>
+          <w:sz w:val="20"/>
+          <w:szCs w:val="20"/>
+          <w:lang w:eastAsia="zh-CN"/>
+        </w:rPr>
+        <w:t>https://github.com/z5516421/z5516421_projectB</w:t>
+      </w:r>
+    </w:p>
+    <w:p>
+      <w:pPr>
+        <w:pStyle w:val="1"/>
+        <w:spacing w:before="120" w:after="80" w:line="240" w:lineRule="auto"/>
+        <w:rPr>
+          <w:b w:val="0"/>
+          <w:bCs w:val="0"/>
+          <w:color w:val="000000" w:themeColor="text1"/>
+          <w:sz w:val="20"/>
+          <w:szCs w:val="20"/>
+          <w:lang w:eastAsia="zh-CN"/>
+        </w:rPr>
+      </w:pPr>
+      <w:r>
+        <w:rPr>
+          <w:b w:val="0"/>
+          <w:bCs w:val="0"/>
+          <w:color w:val="000000" w:themeColor="text1"/>
+          <w:sz w:val="20"/>
+          <w:szCs w:val="20"/>
+          <w:lang w:eastAsia="zh-CN"/>
+        </w:rPr>
+        <w:t xml:space="preserve">Live </w:t>
+      </w:r>
+      <w:proofErr w:type="spellStart"/>
+      <w:r>
+        <w:rPr>
+          <w:b w:val="0"/>
+          <w:bCs w:val="0"/>
+          <w:color w:val="000000" w:themeColor="text1"/>
+          <w:sz w:val="20"/>
+          <w:szCs w:val="20"/>
+          <w:lang w:eastAsia="zh-CN"/>
+        </w:rPr>
+        <w:t>Streamlit</w:t>
+      </w:r>
+      <w:proofErr w:type="spellEnd"/>
+      <w:r>
+        <w:rPr>
+          <w:b w:val="0"/>
+          <w:bCs w:val="0"/>
+          <w:color w:val="000000" w:themeColor="text1"/>
+          <w:sz w:val="20"/>
+          <w:szCs w:val="20"/>
+          <w:lang w:eastAsia="zh-CN"/>
+        </w:rPr>
+        <w:t xml:space="preserve"> application:</w:t>
+      </w:r>
+      <w:r>
+        <w:rPr>
+          <w:rFonts w:hint="eastAsia"/>
+          <w:b w:val="0"/>
+          <w:bCs w:val="0"/>
+          <w:color w:val="000000" w:themeColor="text1"/>
+          <w:sz w:val="20"/>
+          <w:szCs w:val="20"/>
+          <w:lang w:eastAsia="zh-CN"/>
+        </w:rPr>
+        <w:t xml:space="preserve"> </w:t>
+      </w:r>
+      <w:r>
+        <w:rPr>
+          <w:b w:val="0"/>
+          <w:bCs w:val="0"/>
+          <w:color w:val="000000" w:themeColor="text1"/>
+          <w:sz w:val="20"/>
+          <w:szCs w:val="20"/>
+          <w:lang w:eastAsia="zh-CN"/>
+        </w:rPr>
+        <w:t>https://z5516421projectb-kz8ypey82moyim5u4aqbpq.streamlit.app/</w:t>
+      </w:r>
+    </w:p>
+    <w:p>
+      <w:pPr>
+        <w:pStyle w:val="1"/>
+        <w:spacing w:before="120" w:after="80" w:line="240" w:lineRule="auto"/>
+        <w:rPr>
           <w:sz w:val="28"/>
           <w:lang w:eastAsia="zh-CN"/>
         </w:rPr>
@@ -390,6 +511,7 @@
           <w:szCs w:val="22"/>
           <w:lang w:eastAsia="en-US"/>
         </w:rPr>
+        <w:lastRenderedPageBreak/>
         <w:t>The four methods were chosen because they make different trade-offs between simplicity, risk control and forecasting</w:t>
       </w:r>
       <w:r>
@@ -407,17 +529,7 @@
           <w:szCs w:val="22"/>
           <w:lang w:eastAsia="en-US"/>
         </w:rPr>
-        <w:t xml:space="preserve">(Markowitz, 1952). Equal Weight is the clearest benchmark because it spreads capital evenly and </w:t>
-      </w:r>
-      <w:r>
-        <w:rPr>
-          <w:rFonts w:ascii="Calibri" w:eastAsiaTheme="minorEastAsia" w:hAnsi="Calibri" w:cstheme="minorBidi"/>
-          <w:sz w:val="22"/>
-          <w:szCs w:val="22"/>
-          <w:lang w:eastAsia="en-US"/>
-        </w:rPr>
-        <w:lastRenderedPageBreak/>
-        <w:t>makes very few forecasts (DeMiguel et al., 2009). It gives up the chance to use estimated expected returns, while also avoiding the damage caused by poor estimates. Minimum Variance uses the covariance matrix to target lower volatility, so it is more model-based but still avoids expected-return forecasts. Tangency is the most forecast-dependent method because it uses estimated returns and covariances to target the highest expected excess return per unit of risk. This makes it theoretically attractive, but also fragile when expected returns are noisy in short samples. Risk Parity also uses covariance information, although its focus is risk balance rather than return prediction (Maillard et al., 2010). This setup lets the report test whether extra optimisation improves out-of-sample investor outcomes, or whether simpler diversification produces a more robust fund.</w:t>
+        <w:t>(Markowitz, 1952). Equal Weight is the clearest benchmark because it spreads capital evenly and makes very few forecasts (DeMiguel et al., 2009). It gives up the chance to use estimated expected returns, while also avoiding the damage caused by poor estimates. Minimum Variance uses the covariance matrix to target lower volatility, so it is more model-based but still avoids expected-return forecasts. Tangency is the most forecast-dependent method because it uses estimated returns and covariances to target the highest expected excess return per unit of risk. This makes it theoretically attractive, but also fragile when expected returns are noisy in short samples. Risk Parity also uses covariance information, although its focus is risk balance rather than return prediction (Maillard et al., 2010). This setup lets the report test whether extra optimisation improves out-of-sample investor outcomes, or whether simpler diversification produces a more robust fund.</w:t>
       </w:r>
     </w:p>
     <w:p>
@@ -1565,6 +1677,7 @@
                 <w:sz w:val="18"/>
                 <w:szCs w:val="18"/>
               </w:rPr>
+              <w:lastRenderedPageBreak/>
               <w:t>Annuali</w:t>
             </w:r>
             <w:r>
@@ -1730,7 +1843,6 @@
           <w:sz w:val="17"/>
           <w:szCs w:val="18"/>
         </w:rPr>
-        <w:lastRenderedPageBreak/>
         <w:t xml:space="preserve">Source: </w:t>
       </w:r>
       <w:proofErr w:type="spellStart"/>
@@ -2063,6 +2175,7 @@
           <w:szCs w:val="22"/>
           <w:lang w:eastAsia="en-US"/>
         </w:rPr>
+        <w:lastRenderedPageBreak/>
         <w:drawing>
           <wp:inline distT="0" distB="0" distL="0" distR="0" wp14:anchorId="4A5BBE98" wp14:editId="6FDB6992">
             <wp:extent cx="4624705" cy="2582090"/>
@@ -2123,7 +2236,6 @@
           <w:sz w:val="19"/>
           <w:lang w:eastAsia="en-US"/>
         </w:rPr>
-        <w:lastRenderedPageBreak/>
         <w:t>Figure 1. Growth of $1 by fund universe, 2021-2023</w:t>
       </w:r>
     </w:p>
@@ -2154,7 +2266,7 @@
         <w:spacing w:before="0" w:after="0" w:afterAutospacing="0"/>
         <w:jc w:val="both"/>
         <w:rPr>
-          <w:rFonts w:ascii="Calibri" w:eastAsiaTheme="minorEastAsia" w:hAnsi="Calibri" w:cstheme="minorBidi" w:hint="eastAsia"/>
+          <w:rFonts w:ascii="Calibri" w:eastAsiaTheme="minorEastAsia" w:hAnsi="Calibri" w:cstheme="minorBidi"/>
           <w:sz w:val="22"/>
           <w:szCs w:val="22"/>
         </w:rPr>
@@ -2266,6 +2378,7 @@
           <w:sz w:val="19"/>
           <w:lang w:eastAsia="en-US"/>
         </w:rPr>
+        <w:lastRenderedPageBreak/>
         <w:t>Figure 2. Selected equity and combined drawdown paths; crypto-only funds are excluded</w:t>
       </w:r>
     </w:p>
@@ -2390,7 +2503,6 @@
           <w:szCs w:val="22"/>
           <w:lang w:eastAsia="en-US"/>
         </w:rPr>
-        <w:lastRenderedPageBreak/>
         <w:t xml:space="preserve">Tangency’s weak OOS performance is one of the useful findings in the report. In theory, Tangency should target the highest expected Sharpe ratio. In practice, small differences in estimated expected returns can lead to large differences in weights. When the estimated return of one asset or group of assets is temporarily high, the </w:t>
       </w:r>
       <w:proofErr w:type="spellStart"/>
@@ -2565,7 +2677,17 @@
           <w:szCs w:val="22"/>
           <w:lang w:eastAsia="en-US"/>
         </w:rPr>
-        <w:t>For the app, this means the fund ranking should not be shown as a simple leaderboard with one winner. A conservative investor may prefer Equity Equal Weight because it had the best Sharpe ratio and a relatively shallow drawdown. A balanced investor may prefer Combined Risk Parity because it includes crypto exposure without letting crypto dominate total risk. An aggressive investor may still inspect Crypto Risk Parity as a satellite sleeve, but the app should make the drawdown cost clear. This is why the fact sheet design matters. The same fund can look attractive in a return table and much less attractive once the user sees the drawdown path.</w:t>
+        <w:t xml:space="preserve">For the app, this means the fund ranking should not be shown as a simple leaderboard with one winner. A conservative investor may prefer Equity Equal Weight because it had the best Sharpe ratio and a relatively shallow drawdown. A balanced investor may prefer Combined Risk Parity because it includes crypto exposure </w:t>
+      </w:r>
+      <w:r>
+        <w:rPr>
+          <w:rFonts w:ascii="Calibri" w:eastAsiaTheme="minorEastAsia" w:hAnsi="Calibri" w:cstheme="minorBidi"/>
+          <w:sz w:val="22"/>
+          <w:szCs w:val="22"/>
+          <w:lang w:eastAsia="en-US"/>
+        </w:rPr>
+        <w:lastRenderedPageBreak/>
+        <w:t>without letting crypto dominate total risk. An aggressive investor may still inspect Crypto Risk Parity as a satellite sleeve, but the app should make the drawdown cost clear. This is why the fact sheet design matters. The same fund can look attractive in a return table and much less attractive once the user sees the drawdown path.</w:t>
       </w:r>
     </w:p>
     <w:p>
@@ -2613,7 +2735,6 @@
           <w:rFonts w:ascii="Arial" w:hAnsi="Arial" w:cs="Arial"/>
           <w:sz w:val="28"/>
         </w:rPr>
-        <w:lastRenderedPageBreak/>
         <w:t>Sentiment Index and Coverage-Aware Signal</w:t>
       </w:r>
     </w:p>
@@ -2707,6 +2828,7 @@
           <w:szCs w:val="22"/>
           <w:lang w:eastAsia="en-US"/>
         </w:rPr>
+        <w:lastRenderedPageBreak/>
         <w:t>The main original extension beyond the baseline is the coverage-aware lagged sector sentiment signal.</w:t>
       </w:r>
       <w:r>
@@ -3260,7 +3382,6 @@
           <w:szCs w:val="22"/>
           <w:lang w:eastAsia="en-US"/>
         </w:rPr>
-        <w:lastRenderedPageBreak/>
         <w:t xml:space="preserve">In these equations, </w:t>
       </w:r>
       <m:oMath>
@@ -3671,19 +3792,22 @@
     </w:p>
     <w:p>
       <w:pPr>
-        <w:spacing w:after="80" w:line="240" w:lineRule="auto"/>
+        <w:pStyle w:val="pdq2pgselectionanchorcontainer"/>
+        <w:spacing w:before="40"/>
         <w:jc w:val="center"/>
         <w:rPr>
+          <w:rFonts w:ascii="Calibri" w:eastAsiaTheme="minorEastAsia" w:hAnsi="Calibri" w:cstheme="minorBidi"/>
           <w:b/>
           <w:bCs/>
-          <w:sz w:val="22"/>
-          <w:lang w:eastAsia="zh-CN"/>
+          <w:sz w:val="19"/>
         </w:rPr>
       </w:pPr>
       <w:r>
         <w:rPr>
+          <w:rFonts w:ascii="Calibri" w:eastAsiaTheme="minorEastAsia" w:hAnsi="Calibri" w:cstheme="minorBidi"/>
           <w:b/>
           <w:bCs/>
+          <w:sz w:val="19"/>
         </w:rPr>
         <w:t>Figure 5. Standalone sector sentiment index over time, 2020 to 2023</w:t>
       </w:r>
@@ -3701,7 +3825,14 @@
         <w:rPr>
           <w:sz w:val="22"/>
         </w:rPr>
-        <w:t>Figure 5 shows the standalone sentiment index across the ten equity sectors. Most sectors remain close to the middle of the 0 to 100 scale, although temporary differences appear over time. Energy becomes relatively stronger during 2022, while most other sectors stay closer to their usual ranges. The 21-day averages make these movements easier to compare across sectors. This index is used as an investor facing view of sector news tone and is not used directly to change portfolio weights.</w:t>
+        <w:t xml:space="preserve">Figure 5 shows the standalone sentiment index across the ten equity sectors. Most sectors remain close to the middle of the 0 to 100 scale, although temporary differences appear over time. Energy becomes relatively stronger during 2022, while most other sectors stay closer to their usual ranges. The 21-day averages make </w:t>
+      </w:r>
+      <w:r>
+        <w:rPr>
+          <w:sz w:val="22"/>
+        </w:rPr>
+        <w:lastRenderedPageBreak/>
+        <w:t>these movements easier to compare across sectors. This index is used as an investor facing view of sector news tone and is not used directly to change portfolio weights.</w:t>
       </w:r>
     </w:p>
     <w:p>
@@ -3709,7 +3840,7 @@
         <w:pStyle w:val="pdq2pgselectionanchorcontainer"/>
         <w:jc w:val="both"/>
         <w:rPr>
-          <w:rFonts w:ascii="Calibri" w:eastAsiaTheme="minorEastAsia" w:hAnsi="Calibri" w:cstheme="minorBidi" w:hint="eastAsia"/>
+          <w:rFonts w:ascii="Calibri" w:eastAsiaTheme="minorEastAsia" w:hAnsi="Calibri" w:cstheme="minorBidi"/>
           <w:sz w:val="22"/>
           <w:szCs w:val="22"/>
         </w:rPr>
@@ -3739,7 +3870,6 @@
           <w:rFonts w:ascii="Arial" w:hAnsi="Arial" w:cs="Arial"/>
           <w:sz w:val="28"/>
         </w:rPr>
-        <w:lastRenderedPageBreak/>
         <w:t>Portfolio Test of the Sentiment Overlay</w:t>
       </w:r>
     </w:p>
@@ -3803,7 +3933,7 @@
         <w:spacing w:before="40"/>
         <w:jc w:val="center"/>
         <w:rPr>
-          <w:rFonts w:ascii="Calibri" w:eastAsiaTheme="minorEastAsia" w:hAnsi="Calibri" w:cstheme="minorBidi" w:hint="eastAsia"/>
+          <w:rFonts w:ascii="Calibri" w:eastAsiaTheme="minorEastAsia" w:hAnsi="Calibri" w:cstheme="minorBidi"/>
           <w:b/>
           <w:bCs/>
           <w:sz w:val="19"/>
@@ -4824,7 +4954,11 @@
         <w:t xml:space="preserve"> </w:t>
       </w:r>
       <w:r>
-        <w:t>In its current form, the additional turnover is difficult to justify because it was not accompanied by better risk-adjusted performance.</w:t>
+        <w:t xml:space="preserve">In its current </w:t>
+      </w:r>
+      <w:r>
+        <w:lastRenderedPageBreak/>
+        <w:t>form, the additional turnover is difficult to justify because it was not accompanied by better risk-adjusted performance.</w:t>
       </w:r>
     </w:p>
     <w:p>
@@ -4868,7 +5002,6 @@
         </w:rPr>
       </w:pPr>
       <w:r>
-        <w:lastRenderedPageBreak/>
         <w:t>This result is still useful for evaluating the innovation because the signal was tested out of sample rather than assumed to improve performance. The coverage adjustment provides a transparent way to deal with differences in news availability, but the OOS evidence suggests that the sentiment signal needs further refinement before it can be justified as a portfolio overlay.</w:t>
       </w:r>
     </w:p>
@@ -5139,7 +5272,16 @@
           <w:sz w:val="22"/>
           <w:lang w:eastAsia="zh-CN"/>
         </w:rPr>
-        <w:t xml:space="preserve">Second, investors who want crypto exposure should use it carefully inside a combined fund rather than treat a crypto-only fund as the core product. The strongest-return crypto strategies produced the highest terminal wealth, but they also came with very high volatility and drawdowns around or above 80%. Combined Risk Parity is a better product candidate because it kept crypto exposure limited while still allowing some upside. Its Sharpe ratio was 0.79, and its latest crypto sleeve was around 8.6%. This makes crypto more suitable as a satellite allocation than as the </w:t>
+        <w:t xml:space="preserve">Second, investors who want crypto exposure should use it carefully inside a combined fund rather than treat a crypto-only fund as the core product. The strongest-return crypto strategies produced the highest terminal wealth, but they also came with very high volatility and drawdowns around or above 80%. Combined Risk </w:t>
+      </w:r>
+      <w:r>
+        <w:rPr>
+          <w:rFonts w:asciiTheme="majorHAnsi" w:eastAsia="宋体" w:hAnsiTheme="majorHAnsi" w:cstheme="majorHAnsi"/>
+          <w:sz w:val="22"/>
+          <w:lang w:eastAsia="zh-CN"/>
+        </w:rPr>
+        <w:lastRenderedPageBreak/>
+        <w:t xml:space="preserve">Parity is a better product candidate because it kept crypto exposure limited while still allowing some upside. Its Sharpe ratio was 0.79, and its latest crypto sleeve was around 8.6%. This makes crypto more suitable as a satellite allocation than as the </w:t>
       </w:r>
       <w:proofErr w:type="spellStart"/>
       <w:r>
@@ -5174,14 +5316,7 @@
         <w:rPr>
           <w:sz w:val="22"/>
         </w:rPr>
-        <w:t xml:space="preserve">Third, the sentiment overlay should remain an experimental analytics feature for now. The design is transparent, lagged and coverage-aware, but Figure 6 shows that it reduced the Sharpe ratio and increased turnover. I would not remove the sentiment feature because it still makes the app more informative and gives users a clearer view of sector news tone. However, before live use, future tests should try different lag lengths, </w:t>
-      </w:r>
-      <w:r>
-        <w:rPr>
-          <w:sz w:val="22"/>
-        </w:rPr>
-        <w:lastRenderedPageBreak/>
-        <w:t>coverage thresholds, tilt strengths and transaction cost assumptions. In this sample, sentiment analysis made the product more informative, but it did not improve OOS investment performance.</w:t>
+        <w:t>Third, the sentiment overlay should remain an experimental analytics feature for now. The design is transparent, lagged and coverage-aware, but Figure 6 shows that it reduced the Sharpe ratio and increased turnover. I would not remove the sentiment feature because it still makes the app more informative and gives users a clearer view of sector news tone. However, before live use, future tests should try different lag lengths, coverage thresholds, tilt strengths and transaction cost assumptions. In this sample, sentiment analysis made the product more informative, but it did not improve OOS investment performance.</w:t>
       </w:r>
     </w:p>
     <w:p>

</xml_diff>

<commit_message>
Update Part B report
</commit_message>
<xml_diff>
--- a/report/report.docx
+++ b/report/report.docx
@@ -80,66 +80,19 @@
         </w:rPr>
         <w:t xml:space="preserve">  </w:t>
       </w:r>
-      <w:r>
-        <w:rPr>
-          <w:b w:val="0"/>
-          <w:bCs w:val="0"/>
-          <w:color w:val="000000" w:themeColor="text1"/>
-          <w:sz w:val="20"/>
-          <w:szCs w:val="20"/>
-          <w:lang w:eastAsia="zh-CN"/>
-        </w:rPr>
-        <w:t>https://github.com/z5516421/z5516421_projectB</w:t>
-      </w:r>
-    </w:p>
-    <w:p>
-      <w:pPr>
-        <w:pStyle w:val="1"/>
-        <w:spacing w:before="120" w:after="80" w:line="240" w:lineRule="auto"/>
-        <w:rPr>
-          <w:b w:val="0"/>
-          <w:bCs w:val="0"/>
-          <w:color w:val="000000" w:themeColor="text1"/>
-          <w:sz w:val="20"/>
-          <w:szCs w:val="20"/>
-          <w:lang w:eastAsia="zh-CN"/>
-        </w:rPr>
-      </w:pPr>
-      <w:r>
-        <w:rPr>
-          <w:b w:val="0"/>
-          <w:bCs w:val="0"/>
-          <w:color w:val="000000" w:themeColor="text1"/>
-          <w:sz w:val="20"/>
-          <w:szCs w:val="20"/>
-          <w:lang w:eastAsia="zh-CN"/>
-        </w:rPr>
-        <w:t xml:space="preserve">Live </w:t>
-      </w:r>
-      <w:proofErr w:type="spellStart"/>
-      <w:r>
-        <w:rPr>
-          <w:b w:val="0"/>
-          <w:bCs w:val="0"/>
-          <w:color w:val="000000" w:themeColor="text1"/>
-          <w:sz w:val="20"/>
-          <w:szCs w:val="20"/>
-          <w:lang w:eastAsia="zh-CN"/>
-        </w:rPr>
-        <w:t>Streamlit</w:t>
-      </w:r>
-      <w:proofErr w:type="spellEnd"/>
-      <w:r>
-        <w:rPr>
-          <w:b w:val="0"/>
-          <w:bCs w:val="0"/>
-          <w:color w:val="000000" w:themeColor="text1"/>
-          <w:sz w:val="20"/>
-          <w:szCs w:val="20"/>
-          <w:lang w:eastAsia="zh-CN"/>
-        </w:rPr>
-        <w:t xml:space="preserve"> application:</w:t>
-      </w:r>
+      <w:hyperlink r:id="rId8" w:history="1">
+        <w:r>
+          <w:rPr>
+            <w:rStyle w:val="aff7"/>
+            <w:b w:val="0"/>
+            <w:bCs w:val="0"/>
+            <w:sz w:val="20"/>
+            <w:szCs w:val="20"/>
+            <w:lang w:eastAsia="zh-CN"/>
+          </w:rPr>
+          <w:t>https://github.com/z5516421/z5516421_projectB</w:t>
+        </w:r>
+      </w:hyperlink>
       <w:r>
         <w:rPr>
           <w:rFonts w:hint="eastAsia"/>
@@ -152,8 +105,13 @@
         </w:rPr>
         <w:t xml:space="preserve"> </w:t>
       </w:r>
-      <w:r>
-        <w:rPr>
+    </w:p>
+    <w:p>
+      <w:pPr>
+        <w:pStyle w:val="1"/>
+        <w:spacing w:before="120" w:after="80" w:line="240" w:lineRule="auto"/>
+        <w:rPr>
+          <w:rFonts w:hint="eastAsia"/>
           <w:b w:val="0"/>
           <w:bCs w:val="0"/>
           <w:color w:val="000000" w:themeColor="text1"/>
@@ -161,7 +119,78 @@
           <w:szCs w:val="20"/>
           <w:lang w:eastAsia="zh-CN"/>
         </w:rPr>
-        <w:t>https://z5516421projectb-kz8ypey82moyim5u4aqbpq.streamlit.app/</w:t>
+      </w:pPr>
+      <w:r>
+        <w:rPr>
+          <w:b w:val="0"/>
+          <w:bCs w:val="0"/>
+          <w:color w:val="000000" w:themeColor="text1"/>
+          <w:sz w:val="20"/>
+          <w:szCs w:val="20"/>
+          <w:lang w:eastAsia="zh-CN"/>
+        </w:rPr>
+        <w:t xml:space="preserve">Live </w:t>
+      </w:r>
+      <w:proofErr w:type="spellStart"/>
+      <w:r>
+        <w:rPr>
+          <w:b w:val="0"/>
+          <w:bCs w:val="0"/>
+          <w:color w:val="000000" w:themeColor="text1"/>
+          <w:sz w:val="20"/>
+          <w:szCs w:val="20"/>
+          <w:lang w:eastAsia="zh-CN"/>
+        </w:rPr>
+        <w:t>Streamlit</w:t>
+      </w:r>
+      <w:proofErr w:type="spellEnd"/>
+      <w:r>
+        <w:rPr>
+          <w:b w:val="0"/>
+          <w:bCs w:val="0"/>
+          <w:color w:val="000000" w:themeColor="text1"/>
+          <w:sz w:val="20"/>
+          <w:szCs w:val="20"/>
+          <w:lang w:eastAsia="zh-CN"/>
+        </w:rPr>
+        <w:t xml:space="preserve"> application:</w:t>
+      </w:r>
+      <w:r>
+        <w:rPr>
+          <w:rFonts w:hint="eastAsia"/>
+          <w:b w:val="0"/>
+          <w:bCs w:val="0"/>
+          <w:color w:val="000000" w:themeColor="text1"/>
+          <w:sz w:val="20"/>
+          <w:szCs w:val="20"/>
+          <w:lang w:eastAsia="zh-CN"/>
+        </w:rPr>
+        <w:t xml:space="preserve"> </w:t>
+      </w:r>
+      <w:hyperlink r:id="rId9" w:history="1">
+        <w:r>
+          <w:rPr>
+            <w:rStyle w:val="aff7"/>
+            <w:b w:val="0"/>
+            <w:bCs w:val="0"/>
+            <w:sz w:val="20"/>
+            <w:szCs w:val="20"/>
+            <w:lang w:eastAsia="zh-CN"/>
+          </w:rPr>
+          <w:t>https://z5516421projectb-kz8ypey82moyim5u4aqbpq.streamlit.app/</w:t>
+        </w:r>
+      </w:hyperlink>
+      <w:r>
+        <w:rPr>
+          <w:rFonts w:hint="eastAsia"/>
+          <w:b w:val="0"/>
+          <w:bCs w:val="0"/>
+          <w:color w:val="000000" w:themeColor="text1"/>
+          <w:sz w:val="20"/>
+          <w:szCs w:val="20"/>
+          <w:lang w:eastAsia="zh-CN"/>
+        </w:rPr>
+        <w:t xml:space="preserve"> </w:t>
       </w:r>
     </w:p>
     <w:p>
@@ -2194,7 +2223,7 @@
                     </pic:cNvPicPr>
                   </pic:nvPicPr>
                   <pic:blipFill>
-                    <a:blip r:embed="rId8"/>
+                    <a:blip r:embed="rId10"/>
                     <a:stretch>
                       <a:fillRect/>
                     </a:stretch>
@@ -2337,7 +2366,7 @@
                     <pic:cNvPicPr/>
                   </pic:nvPicPr>
                   <pic:blipFill>
-                    <a:blip r:embed="rId9"/>
+                    <a:blip r:embed="rId11"/>
                     <a:stretch>
                       <a:fillRect/>
                     </a:stretch>
@@ -3769,7 +3798,7 @@
                     <pic:cNvPicPr/>
                   </pic:nvPicPr>
                   <pic:blipFill>
-                    <a:blip r:embed="rId10"/>
+                    <a:blip r:embed="rId12"/>
                     <a:stretch>
                       <a:fillRect/>
                     </a:stretch>
@@ -3906,7 +3935,7 @@
                     </pic:cNvPicPr>
                   </pic:nvPicPr>
                   <pic:blipFill>
-                    <a:blip r:embed="rId11"/>
+                    <a:blip r:embed="rId13"/>
                     <a:stretch>
                       <a:fillRect/>
                     </a:stretch>
@@ -5950,8 +5979,8 @@
           <w:lang w:eastAsia="zh-CN"/>
         </w:rPr>
         <w:sectPr>
-          <w:footerReference w:type="even" r:id="rId12"/>
-          <w:footerReference w:type="default" r:id="rId13"/>
+          <w:footerReference w:type="even" r:id="rId14"/>
+          <w:footerReference w:type="default" r:id="rId15"/>
           <w:pgSz w:w="12240" w:h="15840"/>
           <w:pgMar w:top="1181" w:right="1181" w:bottom="1181" w:left="1181" w:header="720" w:footer="720" w:gutter="0"/>
           <w:cols w:space="720"/>
@@ -8543,7 +8572,7 @@
                     </pic:cNvPicPr>
                   </pic:nvPicPr>
                   <pic:blipFill>
-                    <a:blip r:embed="rId14"/>
+                    <a:blip r:embed="rId16"/>
                     <a:stretch>
                       <a:fillRect/>
                     </a:stretch>
@@ -8622,7 +8651,7 @@
                     </pic:cNvPicPr>
                   </pic:nvPicPr>
                   <pic:blipFill>
-                    <a:blip r:embed="rId15"/>
+                    <a:blip r:embed="rId17"/>
                     <a:stretch>
                       <a:fillRect/>
                     </a:stretch>
@@ -8693,7 +8722,7 @@
                     </pic:cNvPicPr>
                   </pic:nvPicPr>
                   <pic:blipFill>
-                    <a:blip r:embed="rId16">
+                    <a:blip r:embed="rId18">
                       <a:extLst>
                         <a:ext uri="{28A0092B-C50C-407E-A947-70E740481C1C}">
                           <a14:useLocalDpi xmlns:a14="http://schemas.microsoft.com/office/drawing/2010/main" val="0"/>
@@ -9400,7 +9429,7 @@
                     <pic:cNvPicPr/>
                   </pic:nvPicPr>
                   <pic:blipFill>
-                    <a:blip r:embed="rId17"/>
+                    <a:blip r:embed="rId19"/>
                     <a:stretch>
                       <a:fillRect/>
                     </a:stretch>
@@ -9449,7 +9478,7 @@
                     <pic:cNvPicPr/>
                   </pic:nvPicPr>
                   <pic:blipFill>
-                    <a:blip r:embed="rId18"/>
+                    <a:blip r:embed="rId20"/>
                     <a:stretch>
                       <a:fillRect/>
                     </a:stretch>
@@ -9615,7 +9644,7 @@
                     <pic:cNvPicPr/>
                   </pic:nvPicPr>
                   <pic:blipFill>
-                    <a:blip r:embed="rId19"/>
+                    <a:blip r:embed="rId21"/>
                     <a:stretch>
                       <a:fillRect/>
                     </a:stretch>
@@ -20969,6 +20998,29 @@
     <w:unhideWhenUsed/>
     <w:rsid w:val="005933E3"/>
   </w:style>
+  <w:style w:type="character" w:styleId="aff7">
+    <w:name w:val="Hyperlink"/>
+    <w:basedOn w:val="a2"/>
+    <w:uiPriority w:val="99"/>
+    <w:unhideWhenUsed/>
+    <w:rsid w:val="009C05E4"/>
+    <w:rPr>
+      <w:color w:val="0000FF" w:themeColor="hyperlink"/>
+      <w:u w:val="single"/>
+    </w:rPr>
+  </w:style>
+  <w:style w:type="character" w:styleId="aff8">
+    <w:name w:val="Unresolved Mention"/>
+    <w:basedOn w:val="a2"/>
+    <w:uiPriority w:val="99"/>
+    <w:semiHidden/>
+    <w:unhideWhenUsed/>
+    <w:rsid w:val="009C05E4"/>
+    <w:rPr>
+      <w:color w:val="605E5C"/>
+      <w:shd w:val="clear" w:color="auto" w:fill="E1DFDD"/>
+    </w:rPr>
+  </w:style>
 </w:styles>
 </file>
 

</xml_diff>

<commit_message>
Update final report references
</commit_message>
<xml_diff>
--- a/report/report.docx
+++ b/report/report.docx
@@ -48,7 +48,6 @@
         <w:pStyle w:val="1"/>
         <w:spacing w:before="120" w:after="80" w:line="240" w:lineRule="auto"/>
         <w:rPr>
-          <w:rFonts w:hint="eastAsia"/>
           <w:b w:val="0"/>
           <w:bCs w:val="0"/>
           <w:color w:val="000000" w:themeColor="text1"/>
@@ -111,7 +110,6 @@
         <w:pStyle w:val="1"/>
         <w:spacing w:before="120" w:after="80" w:line="240" w:lineRule="auto"/>
         <w:rPr>
-          <w:rFonts w:hint="eastAsia"/>
           <w:b w:val="0"/>
           <w:bCs w:val="0"/>
           <w:color w:val="000000" w:themeColor="text1"/>
@@ -2822,7 +2820,21 @@
         <w:rPr>
           <w:sz w:val="22"/>
         </w:rPr>
-        <w:t>The underlying research hypothesis is deliberately modest. If sector news sentiment captures changes in investor attention, risk appetite or perceived fundamentals, then a lagged sector sentiment tilt may improve the OOS risk-adjusted performance of an equity portfolio (Tetlock, 2007). The hypothesis does not assume that every headline contains tradable information. It only assumes that aggregated sector tone may contain a small timing signal after lagging and coverage controls.</w:t>
+        <w:t>The underlying research hypothesis is deliberately modest. If sector</w:t>
+      </w:r>
+      <w:r>
+        <w:rPr>
+          <w:rFonts w:hint="eastAsia"/>
+          <w:sz w:val="22"/>
+          <w:lang w:eastAsia="zh-CN"/>
+        </w:rPr>
+        <w:t xml:space="preserve"> </w:t>
+      </w:r>
+      <w:r>
+        <w:rPr>
+          <w:sz w:val="22"/>
+        </w:rPr>
+        <w:t>news sentiment captures changes in investor attention, risk appetite or perceived fundamentals, then a lagged sector sentiment tilt may improve the OOS risk-adjusted performance of an equity portfolio (Tetlock, 2007). The hypothesis does not assume that every headline contains tradable information. It only assumes that aggregated sector tone may contain a small timing signal after lagging and coverage controls.</w:t>
       </w:r>
     </w:p>
     <w:p>
@@ -9688,15 +9700,6 @@
           <w:lang w:eastAsia="zh-CN"/>
         </w:rPr>
         <w:t>s</w:t>
-      </w:r>
-    </w:p>
-    <w:p>
-      <w:pPr>
-        <w:spacing w:after="80" w:line="240" w:lineRule="auto"/>
-        <w:jc w:val="both"/>
-      </w:pPr>
-      <w:r>
-        <w:t>Baker, M. and Wurgler, J. (2007). Investor sentiment in the stock market. Journal of Economic Perspectives, 21(2), 129-152.</w:t>
       </w:r>
     </w:p>
     <w:p>

</xml_diff>